<commit_message>
web form about us
</commit_message>
<xml_diff>
--- a/requirements touchstone .docx
+++ b/requirements touchstone .docx
@@ -335,6 +335,35 @@
       </w:pPr>
       <w:r>
         <w:t>A “View Cart” button at the top left/right corner of the page will let the user view the currently added items in a modal window. The “View Cart” modal window will have two buttons, one for “Clear Cart” and another for “Process Order.” The “Clear Cart” button will clear the items in the cart, and the “Process Order” button will display a dialog message that says, “Thank you for your order.”</w:t>
+      </w:r>
+    </w:p>
+    <w:p>
+      <w:r>
+        <w:t xml:space="preserve">attach simple alert messages to each button, using the </w:t>
+      </w:r>
+      <w:proofErr w:type="gramStart"/>
+      <w:r>
+        <w:t>alert(</w:t>
+      </w:r>
+      <w:proofErr w:type="gramEnd"/>
+      <w:r>
+        <w:t xml:space="preserve">) function. work must meet the following requirements: Subscribe Feature (All Pages) For the footer on every webpage: Add a click event handler to the “Subscribe” button. When clicked, the alert window should display: “Thank you for subscribing.” Gallery Page Placeholder Cart Buttons </w:t>
+      </w:r>
+      <w:proofErr w:type="gramStart"/>
+      <w:r>
+        <w:t>On</w:t>
+      </w:r>
+      <w:proofErr w:type="gramEnd"/>
+      <w:r>
+        <w:t xml:space="preserve"> the Gallery page, each shopping cart–related button represents a future feature. For this task, attach a simple alert message to each button: Add to Cart button: alert message should display “Item added to the cart.” Clear Cart button: alert message should display “Cart cleared.” Process Order button: alert message should display “Thank you for your order.” No shopping cart functionality, conditional checks, modal windows, or stored items are required. About Us/Contact Page Form Submission </w:t>
+      </w:r>
+      <w:proofErr w:type="gramStart"/>
+      <w:r>
+        <w:t>On</w:t>
+      </w:r>
+      <w:proofErr w:type="gramEnd"/>
+      <w:r>
+        <w:t xml:space="preserve"> the About Us/Contact page: Add a click event handler to the “Submit” button on the contact form. When clicked, the alert window should display: “Thank you for your message.” so storage this code in a separate file JS</w:t>
       </w:r>
     </w:p>
     <w:p/>
@@ -2021,7 +2050,6 @@
   <w:style w:type="character" w:default="1" w:styleId="DefaultParagraphFont">
     <w:name w:val="Default Paragraph Font"/>
     <w:uiPriority w:val="1"/>
-    <w:semiHidden/>
     <w:unhideWhenUsed/>
   </w:style>
   <w:style w:type="table" w:default="1" w:styleId="TableNormal">

</xml_diff>

<commit_message>
sesion storage+Cart item count badge
</commit_message>
<xml_diff>
--- a/requirements touchstone .docx
+++ b/requirements touchstone .docx
@@ -338,6 +338,13 @@
       </w:r>
     </w:p>
     <w:p>
+      <w:pPr>
+        <w:pStyle w:val="ListParagraph"/>
+        <w:numPr>
+          <w:ilvl w:val="0"/>
+          <w:numId w:val="15"/>
+        </w:numPr>
+      </w:pPr>
       <w:r>
         <w:t xml:space="preserve">attach simple alert messages to each button, using the </w:t>
       </w:r>
@@ -366,6 +373,180 @@
         <w:t xml:space="preserve"> the About Us/Contact page: Add a click event handler to the “Submit” button on the contact form. When clicked, the alert window should display: “Thank you for your message.” so storage this code in a separate file JS</w:t>
       </w:r>
     </w:p>
+    <w:p/>
+    <w:p/>
+    <w:p>
+      <w:r>
+        <w:t> store and retrieve data using web storage.</w:t>
+      </w:r>
+    </w:p>
+    <w:p>
+      <w:pPr>
+        <w:numPr>
+          <w:ilvl w:val="0"/>
+          <w:numId w:val="14"/>
+        </w:numPr>
+      </w:pPr>
+      <w:r>
+        <w:t xml:space="preserve">Use </w:t>
+      </w:r>
+      <w:proofErr w:type="spellStart"/>
+      <w:r>
+        <w:t>sessionStorage</w:t>
+      </w:r>
+      <w:proofErr w:type="spellEnd"/>
+      <w:r>
+        <w:t xml:space="preserve"> to add items to the shopping cart as part of the implementation of the “Add to Cart” feature on the Gallery page.</w:t>
+      </w:r>
+    </w:p>
+    <w:p>
+      <w:pPr>
+        <w:pStyle w:val="ListParagraph"/>
+        <w:numPr>
+          <w:ilvl w:val="0"/>
+          <w:numId w:val="14"/>
+        </w:numPr>
+      </w:pPr>
+      <w:r>
+        <w:t xml:space="preserve">Retrieve information about added items in the shopping cart using </w:t>
+      </w:r>
+      <w:proofErr w:type="spellStart"/>
+      <w:r>
+        <w:t>sessionStorage</w:t>
+      </w:r>
+      <w:proofErr w:type="spellEnd"/>
+      <w:r>
+        <w:t xml:space="preserve"> as part of the implementation of the “View Cart” feature on the Gallery page.</w:t>
+      </w:r>
+    </w:p>
+    <w:p>
+      <w:pPr>
+        <w:numPr>
+          <w:ilvl w:val="0"/>
+          <w:numId w:val="14"/>
+        </w:numPr>
+      </w:pPr>
+      <w:r>
+        <w:t xml:space="preserve">Add custom order information to </w:t>
+      </w:r>
+      <w:proofErr w:type="spellStart"/>
+      <w:r>
+        <w:t>localStorage</w:t>
+      </w:r>
+      <w:proofErr w:type="spellEnd"/>
+      <w:r>
+        <w:t xml:space="preserve"> from the web form on the About Us/Contact page.</w:t>
+      </w:r>
+    </w:p>
+    <w:p>
+      <w:r>
+        <w:t xml:space="preserve">Use the IDE to add </w:t>
+      </w:r>
+      <w:proofErr w:type="spellStart"/>
+      <w:r>
+        <w:t>sessionStorage</w:t>
+      </w:r>
+      <w:proofErr w:type="spellEnd"/>
+      <w:r>
+        <w:t xml:space="preserve"> features to add functionality to the “Shopping Cart” and “Custom Order” features.</w:t>
+      </w:r>
+    </w:p>
+    <w:p>
+      <w:pPr>
+        <w:numPr>
+          <w:ilvl w:val="0"/>
+          <w:numId w:val="10"/>
+        </w:numPr>
+      </w:pPr>
+      <w:r>
+        <w:t>We</w:t>
+      </w:r>
+      <w:r>
+        <w:t xml:space="preserve"> will use both </w:t>
+      </w:r>
+      <w:proofErr w:type="spellStart"/>
+      <w:r>
+        <w:t>localStorage</w:t>
+      </w:r>
+      <w:proofErr w:type="spellEnd"/>
+      <w:r>
+        <w:t xml:space="preserve"> and </w:t>
+      </w:r>
+      <w:proofErr w:type="spellStart"/>
+      <w:r>
+        <w:t>sessionStorage</w:t>
+      </w:r>
+      <w:proofErr w:type="spellEnd"/>
+      <w:r>
+        <w:t xml:space="preserve"> for </w:t>
+      </w:r>
+      <w:r>
+        <w:t>our</w:t>
+      </w:r>
+      <w:r>
+        <w:t xml:space="preserve"> webpages.</w:t>
+      </w:r>
+    </w:p>
+    <w:p>
+      <w:pPr>
+        <w:numPr>
+          <w:ilvl w:val="0"/>
+          <w:numId w:val="11"/>
+        </w:numPr>
+      </w:pPr>
+      <w:r>
+        <w:t xml:space="preserve">The “View Cart” modal window should display the item information by reading data from </w:t>
+      </w:r>
+      <w:proofErr w:type="spellStart"/>
+      <w:r>
+        <w:t>sessionStorage</w:t>
+      </w:r>
+      <w:proofErr w:type="spellEnd"/>
+      <w:r>
+        <w:t>.</w:t>
+      </w:r>
+    </w:p>
+    <w:p>
+      <w:pPr>
+        <w:numPr>
+          <w:ilvl w:val="0"/>
+          <w:numId w:val="12"/>
+        </w:numPr>
+      </w:pPr>
+      <w:r>
+        <w:t xml:space="preserve">The “Clear Cart” button and the “Process Order” button in the modal window should clear all the item information in </w:t>
+      </w:r>
+      <w:proofErr w:type="spellStart"/>
+      <w:r>
+        <w:t>sessionStorage</w:t>
+      </w:r>
+      <w:proofErr w:type="spellEnd"/>
+      <w:r>
+        <w:t>.</w:t>
+      </w:r>
+    </w:p>
+    <w:p>
+      <w:pPr>
+        <w:numPr>
+          <w:ilvl w:val="0"/>
+          <w:numId w:val="13"/>
+        </w:numPr>
+      </w:pPr>
+      <w:r>
+        <w:t xml:space="preserve">The About Us/Contact page form should save the customer information and custom order information in </w:t>
+      </w:r>
+      <w:proofErr w:type="spellStart"/>
+      <w:proofErr w:type="gramStart"/>
+      <w:r>
+        <w:t>localStorage</w:t>
+      </w:r>
+      <w:proofErr w:type="spellEnd"/>
+      <w:proofErr w:type="gramEnd"/>
+      <w:r>
+        <w:t>.</w:t>
+      </w:r>
+    </w:p>
+    <w:p/>
     <w:p/>
     <w:p/>
     <w:sectPr>
@@ -381,6 +562,304 @@
 <file path=word/numbering.xml><?xml version="1.0" encoding="utf-8"?>
 <w:numbering xmlns:wpc="http://schemas.microsoft.com/office/word/2010/wordprocessingCanvas" xmlns:cx="http://schemas.microsoft.com/office/drawing/2014/chartex" xmlns:cx1="http://schemas.microsoft.com/office/drawing/2015/9/8/chartex" xmlns:cx2="http://schemas.microsoft.com/office/drawing/2015/10/21/chartex" xmlns:cx3="http://schemas.microsoft.com/office/drawing/2016/5/9/chartex" xmlns:cx4="http://schemas.microsoft.com/office/drawing/2016/5/10/chartex" xmlns:cx5="http://schemas.microsoft.com/office/drawing/2016/5/11/chartex" xmlns:cx6="http://schemas.microsoft.com/office/drawing/2016/5/12/chartex" xmlns:cx7="http://schemas.microsoft.com/office/drawing/2016/5/13/chartex" xmlns:cx8="http://schemas.microsoft.com/office/drawing/2016/5/14/chartex" xmlns:mc="http://schemas.openxmlformats.org/markup-compatibility/2006" xmlns:aink="http://schemas.microsoft.com/office/drawing/2016/ink" xmlns:am3d="http://schemas.microsoft.com/office/drawing/2017/model3d" xmlns:o="urn:schemas-microsoft-com:office:office" xmlns:oel="http://schemas.microsoft.com/office/2019/extlst" xmlns:r="http://schemas.openxmlformats.org/officeDocument/2006/relationships" xmlns:m="http://schemas.openxmlformats.org/officeDocument/2006/math" xmlns:v="urn:schemas-microsoft-com:vml" xmlns:wp14="http://schemas.microsoft.com/office/word/2010/wordprocessingDrawing" xmlns:wp="http://schemas.openxmlformats.org/drawingml/2006/wordprocessingDrawing" xmlns:w10="urn:schemas-microsoft-com:office:word" xmlns:w="http://schemas.openxmlformats.org/wordprocessingml/2006/main" xmlns:w14="http://schemas.microsoft.com/office/word/2010/wordml" xmlns:w15="http://schemas.microsoft.com/office/word/2012/wordml" xmlns:w16cex="http://schemas.microsoft.com/office/word/2018/wordml/cex" xmlns:w16cid="http://schemas.microsoft.com/office/word/2016/wordml/cid" xmlns:w16="http://schemas.microsoft.com/office/word/2018/wordml" xmlns:w16du="http://schemas.microsoft.com/office/word/2023/wordml/word16du" xmlns:w16sdtdh="http://schemas.microsoft.com/office/word/2020/wordml/sdtdatahash" xmlns:w16sdtfl="http://schemas.microsoft.com/office/word/2024/wordml/sdtformatlock" xmlns:w16se="http://schemas.microsoft.com/office/word/2015/wordml/symex" xmlns:wpg="http://schemas.microsoft.com/office/word/2010/wordprocessingGroup" xmlns:wpi="http://schemas.microsoft.com/office/word/2010/wordprocessingInk" xmlns:wne="http://schemas.microsoft.com/office/word/2006/wordml" xmlns:wps="http://schemas.microsoft.com/office/word/2010/wordprocessingShape" mc:Ignorable="w14 w15 w16se w16cid w16 w16cex w16sdtdh w16sdtfl w16du wp14">
   <w:abstractNum w:abstractNumId="0" w15:restartNumberingAfterBreak="0">
+    <w:nsid w:val="0DBF1614"/>
+    <w:multiLevelType w:val="multilevel"/>
+    <w:tmpl w:val="47366D5E"/>
+    <w:lvl w:ilvl="0">
+      <w:start w:val="1"/>
+      <w:numFmt w:val="bullet"/>
+      <w:lvlText w:val=""/>
+      <w:lvlJc w:val="left"/>
+      <w:pPr>
+        <w:tabs>
+          <w:tab w:val="num" w:pos="720"/>
+        </w:tabs>
+        <w:ind w:left="720" w:hanging="360"/>
+      </w:pPr>
+      <w:rPr>
+        <w:rFonts w:ascii="Symbol" w:hAnsi="Symbol" w:hint="default"/>
+        <w:sz w:val="20"/>
+      </w:rPr>
+    </w:lvl>
+    <w:lvl w:ilvl="1" w:tentative="1">
+      <w:start w:val="1"/>
+      <w:numFmt w:val="bullet"/>
+      <w:lvlText w:val=""/>
+      <w:lvlJc w:val="left"/>
+      <w:pPr>
+        <w:tabs>
+          <w:tab w:val="num" w:pos="1440"/>
+        </w:tabs>
+        <w:ind w:left="1440" w:hanging="360"/>
+      </w:pPr>
+      <w:rPr>
+        <w:rFonts w:ascii="Symbol" w:hAnsi="Symbol" w:hint="default"/>
+        <w:sz w:val="20"/>
+      </w:rPr>
+    </w:lvl>
+    <w:lvl w:ilvl="2" w:tentative="1">
+      <w:start w:val="1"/>
+      <w:numFmt w:val="bullet"/>
+      <w:lvlText w:val=""/>
+      <w:lvlJc w:val="left"/>
+      <w:pPr>
+        <w:tabs>
+          <w:tab w:val="num" w:pos="2160"/>
+        </w:tabs>
+        <w:ind w:left="2160" w:hanging="360"/>
+      </w:pPr>
+      <w:rPr>
+        <w:rFonts w:ascii="Symbol" w:hAnsi="Symbol" w:hint="default"/>
+        <w:sz w:val="20"/>
+      </w:rPr>
+    </w:lvl>
+    <w:lvl w:ilvl="3" w:tentative="1">
+      <w:start w:val="1"/>
+      <w:numFmt w:val="bullet"/>
+      <w:lvlText w:val=""/>
+      <w:lvlJc w:val="left"/>
+      <w:pPr>
+        <w:tabs>
+          <w:tab w:val="num" w:pos="2880"/>
+        </w:tabs>
+        <w:ind w:left="2880" w:hanging="360"/>
+      </w:pPr>
+      <w:rPr>
+        <w:rFonts w:ascii="Symbol" w:hAnsi="Symbol" w:hint="default"/>
+        <w:sz w:val="20"/>
+      </w:rPr>
+    </w:lvl>
+    <w:lvl w:ilvl="4" w:tentative="1">
+      <w:start w:val="1"/>
+      <w:numFmt w:val="bullet"/>
+      <w:lvlText w:val=""/>
+      <w:lvlJc w:val="left"/>
+      <w:pPr>
+        <w:tabs>
+          <w:tab w:val="num" w:pos="3600"/>
+        </w:tabs>
+        <w:ind w:left="3600" w:hanging="360"/>
+      </w:pPr>
+      <w:rPr>
+        <w:rFonts w:ascii="Symbol" w:hAnsi="Symbol" w:hint="default"/>
+        <w:sz w:val="20"/>
+      </w:rPr>
+    </w:lvl>
+    <w:lvl w:ilvl="5" w:tentative="1">
+      <w:start w:val="1"/>
+      <w:numFmt w:val="bullet"/>
+      <w:lvlText w:val=""/>
+      <w:lvlJc w:val="left"/>
+      <w:pPr>
+        <w:tabs>
+          <w:tab w:val="num" w:pos="4320"/>
+        </w:tabs>
+        <w:ind w:left="4320" w:hanging="360"/>
+      </w:pPr>
+      <w:rPr>
+        <w:rFonts w:ascii="Symbol" w:hAnsi="Symbol" w:hint="default"/>
+        <w:sz w:val="20"/>
+      </w:rPr>
+    </w:lvl>
+    <w:lvl w:ilvl="6" w:tentative="1">
+      <w:start w:val="1"/>
+      <w:numFmt w:val="bullet"/>
+      <w:lvlText w:val=""/>
+      <w:lvlJc w:val="left"/>
+      <w:pPr>
+        <w:tabs>
+          <w:tab w:val="num" w:pos="5040"/>
+        </w:tabs>
+        <w:ind w:left="5040" w:hanging="360"/>
+      </w:pPr>
+      <w:rPr>
+        <w:rFonts w:ascii="Symbol" w:hAnsi="Symbol" w:hint="default"/>
+        <w:sz w:val="20"/>
+      </w:rPr>
+    </w:lvl>
+    <w:lvl w:ilvl="7" w:tentative="1">
+      <w:start w:val="1"/>
+      <w:numFmt w:val="bullet"/>
+      <w:lvlText w:val=""/>
+      <w:lvlJc w:val="left"/>
+      <w:pPr>
+        <w:tabs>
+          <w:tab w:val="num" w:pos="5760"/>
+        </w:tabs>
+        <w:ind w:left="5760" w:hanging="360"/>
+      </w:pPr>
+      <w:rPr>
+        <w:rFonts w:ascii="Symbol" w:hAnsi="Symbol" w:hint="default"/>
+        <w:sz w:val="20"/>
+      </w:rPr>
+    </w:lvl>
+    <w:lvl w:ilvl="8" w:tentative="1">
+      <w:start w:val="1"/>
+      <w:numFmt w:val="bullet"/>
+      <w:lvlText w:val=""/>
+      <w:lvlJc w:val="left"/>
+      <w:pPr>
+        <w:tabs>
+          <w:tab w:val="num" w:pos="6480"/>
+        </w:tabs>
+        <w:ind w:left="6480" w:hanging="360"/>
+      </w:pPr>
+      <w:rPr>
+        <w:rFonts w:ascii="Symbol" w:hAnsi="Symbol" w:hint="default"/>
+        <w:sz w:val="20"/>
+      </w:rPr>
+    </w:lvl>
+  </w:abstractNum>
+  <w:abstractNum w:abstractNumId="1" w15:restartNumberingAfterBreak="0">
+    <w:nsid w:val="16EF005C"/>
+    <w:multiLevelType w:val="multilevel"/>
+    <w:tmpl w:val="E9AE4840"/>
+    <w:lvl w:ilvl="0">
+      <w:start w:val="1"/>
+      <w:numFmt w:val="bullet"/>
+      <w:lvlText w:val=""/>
+      <w:lvlJc w:val="left"/>
+      <w:pPr>
+        <w:tabs>
+          <w:tab w:val="num" w:pos="720"/>
+        </w:tabs>
+        <w:ind w:left="720" w:hanging="360"/>
+      </w:pPr>
+      <w:rPr>
+        <w:rFonts w:ascii="Symbol" w:hAnsi="Symbol" w:hint="default"/>
+        <w:sz w:val="20"/>
+      </w:rPr>
+    </w:lvl>
+    <w:lvl w:ilvl="1" w:tentative="1">
+      <w:start w:val="1"/>
+      <w:numFmt w:val="bullet"/>
+      <w:lvlText w:val=""/>
+      <w:lvlJc w:val="left"/>
+      <w:pPr>
+        <w:tabs>
+          <w:tab w:val="num" w:pos="1440"/>
+        </w:tabs>
+        <w:ind w:left="1440" w:hanging="360"/>
+      </w:pPr>
+      <w:rPr>
+        <w:rFonts w:ascii="Symbol" w:hAnsi="Symbol" w:hint="default"/>
+        <w:sz w:val="20"/>
+      </w:rPr>
+    </w:lvl>
+    <w:lvl w:ilvl="2" w:tentative="1">
+      <w:start w:val="1"/>
+      <w:numFmt w:val="bullet"/>
+      <w:lvlText w:val=""/>
+      <w:lvlJc w:val="left"/>
+      <w:pPr>
+        <w:tabs>
+          <w:tab w:val="num" w:pos="2160"/>
+        </w:tabs>
+        <w:ind w:left="2160" w:hanging="360"/>
+      </w:pPr>
+      <w:rPr>
+        <w:rFonts w:ascii="Symbol" w:hAnsi="Symbol" w:hint="default"/>
+        <w:sz w:val="20"/>
+      </w:rPr>
+    </w:lvl>
+    <w:lvl w:ilvl="3" w:tentative="1">
+      <w:start w:val="1"/>
+      <w:numFmt w:val="bullet"/>
+      <w:lvlText w:val=""/>
+      <w:lvlJc w:val="left"/>
+      <w:pPr>
+        <w:tabs>
+          <w:tab w:val="num" w:pos="2880"/>
+        </w:tabs>
+        <w:ind w:left="2880" w:hanging="360"/>
+      </w:pPr>
+      <w:rPr>
+        <w:rFonts w:ascii="Symbol" w:hAnsi="Symbol" w:hint="default"/>
+        <w:sz w:val="20"/>
+      </w:rPr>
+    </w:lvl>
+    <w:lvl w:ilvl="4" w:tentative="1">
+      <w:start w:val="1"/>
+      <w:numFmt w:val="bullet"/>
+      <w:lvlText w:val=""/>
+      <w:lvlJc w:val="left"/>
+      <w:pPr>
+        <w:tabs>
+          <w:tab w:val="num" w:pos="3600"/>
+        </w:tabs>
+        <w:ind w:left="3600" w:hanging="360"/>
+      </w:pPr>
+      <w:rPr>
+        <w:rFonts w:ascii="Symbol" w:hAnsi="Symbol" w:hint="default"/>
+        <w:sz w:val="20"/>
+      </w:rPr>
+    </w:lvl>
+    <w:lvl w:ilvl="5" w:tentative="1">
+      <w:start w:val="1"/>
+      <w:numFmt w:val="bullet"/>
+      <w:lvlText w:val=""/>
+      <w:lvlJc w:val="left"/>
+      <w:pPr>
+        <w:tabs>
+          <w:tab w:val="num" w:pos="4320"/>
+        </w:tabs>
+        <w:ind w:left="4320" w:hanging="360"/>
+      </w:pPr>
+      <w:rPr>
+        <w:rFonts w:ascii="Symbol" w:hAnsi="Symbol" w:hint="default"/>
+        <w:sz w:val="20"/>
+      </w:rPr>
+    </w:lvl>
+    <w:lvl w:ilvl="6" w:tentative="1">
+      <w:start w:val="1"/>
+      <w:numFmt w:val="bullet"/>
+      <w:lvlText w:val=""/>
+      <w:lvlJc w:val="left"/>
+      <w:pPr>
+        <w:tabs>
+          <w:tab w:val="num" w:pos="5040"/>
+        </w:tabs>
+        <w:ind w:left="5040" w:hanging="360"/>
+      </w:pPr>
+      <w:rPr>
+        <w:rFonts w:ascii="Symbol" w:hAnsi="Symbol" w:hint="default"/>
+        <w:sz w:val="20"/>
+      </w:rPr>
+    </w:lvl>
+    <w:lvl w:ilvl="7" w:tentative="1">
+      <w:start w:val="1"/>
+      <w:numFmt w:val="bullet"/>
+      <w:lvlText w:val=""/>
+      <w:lvlJc w:val="left"/>
+      <w:pPr>
+        <w:tabs>
+          <w:tab w:val="num" w:pos="5760"/>
+        </w:tabs>
+        <w:ind w:left="5760" w:hanging="360"/>
+      </w:pPr>
+      <w:rPr>
+        <w:rFonts w:ascii="Symbol" w:hAnsi="Symbol" w:hint="default"/>
+        <w:sz w:val="20"/>
+      </w:rPr>
+    </w:lvl>
+    <w:lvl w:ilvl="8" w:tentative="1">
+      <w:start w:val="1"/>
+      <w:numFmt w:val="bullet"/>
+      <w:lvlText w:val=""/>
+      <w:lvlJc w:val="left"/>
+      <w:pPr>
+        <w:tabs>
+          <w:tab w:val="num" w:pos="6480"/>
+        </w:tabs>
+        <w:ind w:left="6480" w:hanging="360"/>
+      </w:pPr>
+      <w:rPr>
+        <w:rFonts w:ascii="Symbol" w:hAnsi="Symbol" w:hint="default"/>
+        <w:sz w:val="20"/>
+      </w:rPr>
+    </w:lvl>
+  </w:abstractNum>
+  <w:abstractNum w:abstractNumId="2" w15:restartNumberingAfterBreak="0">
     <w:nsid w:val="23A1157D"/>
     <w:multiLevelType w:val="multilevel"/>
     <w:tmpl w:val="3C947D68"/>
@@ -529,7 +1008,7 @@
       </w:rPr>
     </w:lvl>
   </w:abstractNum>
-  <w:abstractNum w:abstractNumId="1" w15:restartNumberingAfterBreak="0">
+  <w:abstractNum w:abstractNumId="3" w15:restartNumberingAfterBreak="0">
     <w:nsid w:val="28E06186"/>
     <w:multiLevelType w:val="multilevel"/>
     <w:tmpl w:val="24367052"/>
@@ -678,7 +1157,305 @@
       </w:rPr>
     </w:lvl>
   </w:abstractNum>
-  <w:abstractNum w:abstractNumId="2" w15:restartNumberingAfterBreak="0">
+  <w:abstractNum w:abstractNumId="4" w15:restartNumberingAfterBreak="0">
+    <w:nsid w:val="3CBA74D8"/>
+    <w:multiLevelType w:val="multilevel"/>
+    <w:tmpl w:val="8334DDF0"/>
+    <w:lvl w:ilvl="0">
+      <w:start w:val="1"/>
+      <w:numFmt w:val="bullet"/>
+      <w:lvlText w:val=""/>
+      <w:lvlJc w:val="left"/>
+      <w:pPr>
+        <w:tabs>
+          <w:tab w:val="num" w:pos="720"/>
+        </w:tabs>
+        <w:ind w:left="720" w:hanging="360"/>
+      </w:pPr>
+      <w:rPr>
+        <w:rFonts w:ascii="Symbol" w:hAnsi="Symbol" w:hint="default"/>
+        <w:sz w:val="20"/>
+      </w:rPr>
+    </w:lvl>
+    <w:lvl w:ilvl="1" w:tentative="1">
+      <w:start w:val="1"/>
+      <w:numFmt w:val="bullet"/>
+      <w:lvlText w:val=""/>
+      <w:lvlJc w:val="left"/>
+      <w:pPr>
+        <w:tabs>
+          <w:tab w:val="num" w:pos="1440"/>
+        </w:tabs>
+        <w:ind w:left="1440" w:hanging="360"/>
+      </w:pPr>
+      <w:rPr>
+        <w:rFonts w:ascii="Symbol" w:hAnsi="Symbol" w:hint="default"/>
+        <w:sz w:val="20"/>
+      </w:rPr>
+    </w:lvl>
+    <w:lvl w:ilvl="2" w:tentative="1">
+      <w:start w:val="1"/>
+      <w:numFmt w:val="bullet"/>
+      <w:lvlText w:val=""/>
+      <w:lvlJc w:val="left"/>
+      <w:pPr>
+        <w:tabs>
+          <w:tab w:val="num" w:pos="2160"/>
+        </w:tabs>
+        <w:ind w:left="2160" w:hanging="360"/>
+      </w:pPr>
+      <w:rPr>
+        <w:rFonts w:ascii="Symbol" w:hAnsi="Symbol" w:hint="default"/>
+        <w:sz w:val="20"/>
+      </w:rPr>
+    </w:lvl>
+    <w:lvl w:ilvl="3" w:tentative="1">
+      <w:start w:val="1"/>
+      <w:numFmt w:val="bullet"/>
+      <w:lvlText w:val=""/>
+      <w:lvlJc w:val="left"/>
+      <w:pPr>
+        <w:tabs>
+          <w:tab w:val="num" w:pos="2880"/>
+        </w:tabs>
+        <w:ind w:left="2880" w:hanging="360"/>
+      </w:pPr>
+      <w:rPr>
+        <w:rFonts w:ascii="Symbol" w:hAnsi="Symbol" w:hint="default"/>
+        <w:sz w:val="20"/>
+      </w:rPr>
+    </w:lvl>
+    <w:lvl w:ilvl="4" w:tentative="1">
+      <w:start w:val="1"/>
+      <w:numFmt w:val="bullet"/>
+      <w:lvlText w:val=""/>
+      <w:lvlJc w:val="left"/>
+      <w:pPr>
+        <w:tabs>
+          <w:tab w:val="num" w:pos="3600"/>
+        </w:tabs>
+        <w:ind w:left="3600" w:hanging="360"/>
+      </w:pPr>
+      <w:rPr>
+        <w:rFonts w:ascii="Symbol" w:hAnsi="Symbol" w:hint="default"/>
+        <w:sz w:val="20"/>
+      </w:rPr>
+    </w:lvl>
+    <w:lvl w:ilvl="5" w:tentative="1">
+      <w:start w:val="1"/>
+      <w:numFmt w:val="bullet"/>
+      <w:lvlText w:val=""/>
+      <w:lvlJc w:val="left"/>
+      <w:pPr>
+        <w:tabs>
+          <w:tab w:val="num" w:pos="4320"/>
+        </w:tabs>
+        <w:ind w:left="4320" w:hanging="360"/>
+      </w:pPr>
+      <w:rPr>
+        <w:rFonts w:ascii="Symbol" w:hAnsi="Symbol" w:hint="default"/>
+        <w:sz w:val="20"/>
+      </w:rPr>
+    </w:lvl>
+    <w:lvl w:ilvl="6" w:tentative="1">
+      <w:start w:val="1"/>
+      <w:numFmt w:val="bullet"/>
+      <w:lvlText w:val=""/>
+      <w:lvlJc w:val="left"/>
+      <w:pPr>
+        <w:tabs>
+          <w:tab w:val="num" w:pos="5040"/>
+        </w:tabs>
+        <w:ind w:left="5040" w:hanging="360"/>
+      </w:pPr>
+      <w:rPr>
+        <w:rFonts w:ascii="Symbol" w:hAnsi="Symbol" w:hint="default"/>
+        <w:sz w:val="20"/>
+      </w:rPr>
+    </w:lvl>
+    <w:lvl w:ilvl="7" w:tentative="1">
+      <w:start w:val="1"/>
+      <w:numFmt w:val="bullet"/>
+      <w:lvlText w:val=""/>
+      <w:lvlJc w:val="left"/>
+      <w:pPr>
+        <w:tabs>
+          <w:tab w:val="num" w:pos="5760"/>
+        </w:tabs>
+        <w:ind w:left="5760" w:hanging="360"/>
+      </w:pPr>
+      <w:rPr>
+        <w:rFonts w:ascii="Symbol" w:hAnsi="Symbol" w:hint="default"/>
+        <w:sz w:val="20"/>
+      </w:rPr>
+    </w:lvl>
+    <w:lvl w:ilvl="8" w:tentative="1">
+      <w:start w:val="1"/>
+      <w:numFmt w:val="bullet"/>
+      <w:lvlText w:val=""/>
+      <w:lvlJc w:val="left"/>
+      <w:pPr>
+        <w:tabs>
+          <w:tab w:val="num" w:pos="6480"/>
+        </w:tabs>
+        <w:ind w:left="6480" w:hanging="360"/>
+      </w:pPr>
+      <w:rPr>
+        <w:rFonts w:ascii="Symbol" w:hAnsi="Symbol" w:hint="default"/>
+        <w:sz w:val="20"/>
+      </w:rPr>
+    </w:lvl>
+  </w:abstractNum>
+  <w:abstractNum w:abstractNumId="5" w15:restartNumberingAfterBreak="0">
+    <w:nsid w:val="46520BFF"/>
+    <w:multiLevelType w:val="multilevel"/>
+    <w:tmpl w:val="C26E9410"/>
+    <w:lvl w:ilvl="0">
+      <w:start w:val="1"/>
+      <w:numFmt w:val="bullet"/>
+      <w:lvlText w:val=""/>
+      <w:lvlJc w:val="left"/>
+      <w:pPr>
+        <w:tabs>
+          <w:tab w:val="num" w:pos="720"/>
+        </w:tabs>
+        <w:ind w:left="720" w:hanging="360"/>
+      </w:pPr>
+      <w:rPr>
+        <w:rFonts w:ascii="Symbol" w:hAnsi="Symbol" w:hint="default"/>
+        <w:sz w:val="20"/>
+      </w:rPr>
+    </w:lvl>
+    <w:lvl w:ilvl="1" w:tentative="1">
+      <w:start w:val="1"/>
+      <w:numFmt w:val="bullet"/>
+      <w:lvlText w:val=""/>
+      <w:lvlJc w:val="left"/>
+      <w:pPr>
+        <w:tabs>
+          <w:tab w:val="num" w:pos="1440"/>
+        </w:tabs>
+        <w:ind w:left="1440" w:hanging="360"/>
+      </w:pPr>
+      <w:rPr>
+        <w:rFonts w:ascii="Symbol" w:hAnsi="Symbol" w:hint="default"/>
+        <w:sz w:val="20"/>
+      </w:rPr>
+    </w:lvl>
+    <w:lvl w:ilvl="2" w:tentative="1">
+      <w:start w:val="1"/>
+      <w:numFmt w:val="bullet"/>
+      <w:lvlText w:val=""/>
+      <w:lvlJc w:val="left"/>
+      <w:pPr>
+        <w:tabs>
+          <w:tab w:val="num" w:pos="2160"/>
+        </w:tabs>
+        <w:ind w:left="2160" w:hanging="360"/>
+      </w:pPr>
+      <w:rPr>
+        <w:rFonts w:ascii="Symbol" w:hAnsi="Symbol" w:hint="default"/>
+        <w:sz w:val="20"/>
+      </w:rPr>
+    </w:lvl>
+    <w:lvl w:ilvl="3" w:tentative="1">
+      <w:start w:val="1"/>
+      <w:numFmt w:val="bullet"/>
+      <w:lvlText w:val=""/>
+      <w:lvlJc w:val="left"/>
+      <w:pPr>
+        <w:tabs>
+          <w:tab w:val="num" w:pos="2880"/>
+        </w:tabs>
+        <w:ind w:left="2880" w:hanging="360"/>
+      </w:pPr>
+      <w:rPr>
+        <w:rFonts w:ascii="Symbol" w:hAnsi="Symbol" w:hint="default"/>
+        <w:sz w:val="20"/>
+      </w:rPr>
+    </w:lvl>
+    <w:lvl w:ilvl="4" w:tentative="1">
+      <w:start w:val="1"/>
+      <w:numFmt w:val="bullet"/>
+      <w:lvlText w:val=""/>
+      <w:lvlJc w:val="left"/>
+      <w:pPr>
+        <w:tabs>
+          <w:tab w:val="num" w:pos="3600"/>
+        </w:tabs>
+        <w:ind w:left="3600" w:hanging="360"/>
+      </w:pPr>
+      <w:rPr>
+        <w:rFonts w:ascii="Symbol" w:hAnsi="Symbol" w:hint="default"/>
+        <w:sz w:val="20"/>
+      </w:rPr>
+    </w:lvl>
+    <w:lvl w:ilvl="5" w:tentative="1">
+      <w:start w:val="1"/>
+      <w:numFmt w:val="bullet"/>
+      <w:lvlText w:val=""/>
+      <w:lvlJc w:val="left"/>
+      <w:pPr>
+        <w:tabs>
+          <w:tab w:val="num" w:pos="4320"/>
+        </w:tabs>
+        <w:ind w:left="4320" w:hanging="360"/>
+      </w:pPr>
+      <w:rPr>
+        <w:rFonts w:ascii="Symbol" w:hAnsi="Symbol" w:hint="default"/>
+        <w:sz w:val="20"/>
+      </w:rPr>
+    </w:lvl>
+    <w:lvl w:ilvl="6" w:tentative="1">
+      <w:start w:val="1"/>
+      <w:numFmt w:val="bullet"/>
+      <w:lvlText w:val=""/>
+      <w:lvlJc w:val="left"/>
+      <w:pPr>
+        <w:tabs>
+          <w:tab w:val="num" w:pos="5040"/>
+        </w:tabs>
+        <w:ind w:left="5040" w:hanging="360"/>
+      </w:pPr>
+      <w:rPr>
+        <w:rFonts w:ascii="Symbol" w:hAnsi="Symbol" w:hint="default"/>
+        <w:sz w:val="20"/>
+      </w:rPr>
+    </w:lvl>
+    <w:lvl w:ilvl="7" w:tentative="1">
+      <w:start w:val="1"/>
+      <w:numFmt w:val="bullet"/>
+      <w:lvlText w:val=""/>
+      <w:lvlJc w:val="left"/>
+      <w:pPr>
+        <w:tabs>
+          <w:tab w:val="num" w:pos="5760"/>
+        </w:tabs>
+        <w:ind w:left="5760" w:hanging="360"/>
+      </w:pPr>
+      <w:rPr>
+        <w:rFonts w:ascii="Symbol" w:hAnsi="Symbol" w:hint="default"/>
+        <w:sz w:val="20"/>
+      </w:rPr>
+    </w:lvl>
+    <w:lvl w:ilvl="8" w:tentative="1">
+      <w:start w:val="1"/>
+      <w:numFmt w:val="bullet"/>
+      <w:lvlText w:val=""/>
+      <w:lvlJc w:val="left"/>
+      <w:pPr>
+        <w:tabs>
+          <w:tab w:val="num" w:pos="6480"/>
+        </w:tabs>
+        <w:ind w:left="6480" w:hanging="360"/>
+      </w:pPr>
+      <w:rPr>
+        <w:rFonts w:ascii="Symbol" w:hAnsi="Symbol" w:hint="default"/>
+        <w:sz w:val="20"/>
+      </w:rPr>
+    </w:lvl>
+  </w:abstractNum>
+  <w:abstractNum w:abstractNumId="6" w15:restartNumberingAfterBreak="0">
     <w:nsid w:val="4BAC4A7C"/>
     <w:multiLevelType w:val="multilevel"/>
     <w:tmpl w:val="6D303108"/>
@@ -827,7 +1604,7 @@
       </w:rPr>
     </w:lvl>
   </w:abstractNum>
-  <w:abstractNum w:abstractNumId="3" w15:restartNumberingAfterBreak="0">
+  <w:abstractNum w:abstractNumId="7" w15:restartNumberingAfterBreak="0">
     <w:nsid w:val="53FB7910"/>
     <w:multiLevelType w:val="multilevel"/>
     <w:tmpl w:val="7E529ECE"/>
@@ -976,7 +1753,7 @@
       </w:rPr>
     </w:lvl>
   </w:abstractNum>
-  <w:abstractNum w:abstractNumId="4" w15:restartNumberingAfterBreak="0">
+  <w:abstractNum w:abstractNumId="8" w15:restartNumberingAfterBreak="0">
     <w:nsid w:val="56291E36"/>
     <w:multiLevelType w:val="multilevel"/>
     <w:tmpl w:val="748A4222"/>
@@ -1125,7 +1902,567 @@
       </w:rPr>
     </w:lvl>
   </w:abstractNum>
-  <w:abstractNum w:abstractNumId="5" w15:restartNumberingAfterBreak="0">
+  <w:abstractNum w:abstractNumId="9" w15:restartNumberingAfterBreak="0">
+    <w:nsid w:val="5D3041FE"/>
+    <w:multiLevelType w:val="multilevel"/>
+    <w:tmpl w:val="DCFE7F88"/>
+    <w:lvl w:ilvl="0">
+      <w:start w:val="1"/>
+      <w:numFmt w:val="bullet"/>
+      <w:lvlText w:val=""/>
+      <w:lvlJc w:val="left"/>
+      <w:pPr>
+        <w:tabs>
+          <w:tab w:val="num" w:pos="720"/>
+        </w:tabs>
+        <w:ind w:left="720" w:hanging="360"/>
+      </w:pPr>
+      <w:rPr>
+        <w:rFonts w:ascii="Symbol" w:hAnsi="Symbol" w:hint="default"/>
+        <w:sz w:val="20"/>
+      </w:rPr>
+    </w:lvl>
+    <w:lvl w:ilvl="1" w:tentative="1">
+      <w:start w:val="1"/>
+      <w:numFmt w:val="bullet"/>
+      <w:lvlText w:val=""/>
+      <w:lvlJc w:val="left"/>
+      <w:pPr>
+        <w:tabs>
+          <w:tab w:val="num" w:pos="1440"/>
+        </w:tabs>
+        <w:ind w:left="1440" w:hanging="360"/>
+      </w:pPr>
+      <w:rPr>
+        <w:rFonts w:ascii="Symbol" w:hAnsi="Symbol" w:hint="default"/>
+        <w:sz w:val="20"/>
+      </w:rPr>
+    </w:lvl>
+    <w:lvl w:ilvl="2" w:tentative="1">
+      <w:start w:val="1"/>
+      <w:numFmt w:val="bullet"/>
+      <w:lvlText w:val=""/>
+      <w:lvlJc w:val="left"/>
+      <w:pPr>
+        <w:tabs>
+          <w:tab w:val="num" w:pos="2160"/>
+        </w:tabs>
+        <w:ind w:left="2160" w:hanging="360"/>
+      </w:pPr>
+      <w:rPr>
+        <w:rFonts w:ascii="Symbol" w:hAnsi="Symbol" w:hint="default"/>
+        <w:sz w:val="20"/>
+      </w:rPr>
+    </w:lvl>
+    <w:lvl w:ilvl="3" w:tentative="1">
+      <w:start w:val="1"/>
+      <w:numFmt w:val="bullet"/>
+      <w:lvlText w:val=""/>
+      <w:lvlJc w:val="left"/>
+      <w:pPr>
+        <w:tabs>
+          <w:tab w:val="num" w:pos="2880"/>
+        </w:tabs>
+        <w:ind w:left="2880" w:hanging="360"/>
+      </w:pPr>
+      <w:rPr>
+        <w:rFonts w:ascii="Symbol" w:hAnsi="Symbol" w:hint="default"/>
+        <w:sz w:val="20"/>
+      </w:rPr>
+    </w:lvl>
+    <w:lvl w:ilvl="4" w:tentative="1">
+      <w:start w:val="1"/>
+      <w:numFmt w:val="bullet"/>
+      <w:lvlText w:val=""/>
+      <w:lvlJc w:val="left"/>
+      <w:pPr>
+        <w:tabs>
+          <w:tab w:val="num" w:pos="3600"/>
+        </w:tabs>
+        <w:ind w:left="3600" w:hanging="360"/>
+      </w:pPr>
+      <w:rPr>
+        <w:rFonts w:ascii="Symbol" w:hAnsi="Symbol" w:hint="default"/>
+        <w:sz w:val="20"/>
+      </w:rPr>
+    </w:lvl>
+    <w:lvl w:ilvl="5" w:tentative="1">
+      <w:start w:val="1"/>
+      <w:numFmt w:val="bullet"/>
+      <w:lvlText w:val=""/>
+      <w:lvlJc w:val="left"/>
+      <w:pPr>
+        <w:tabs>
+          <w:tab w:val="num" w:pos="4320"/>
+        </w:tabs>
+        <w:ind w:left="4320" w:hanging="360"/>
+      </w:pPr>
+      <w:rPr>
+        <w:rFonts w:ascii="Symbol" w:hAnsi="Symbol" w:hint="default"/>
+        <w:sz w:val="20"/>
+      </w:rPr>
+    </w:lvl>
+    <w:lvl w:ilvl="6" w:tentative="1">
+      <w:start w:val="1"/>
+      <w:numFmt w:val="bullet"/>
+      <w:lvlText w:val=""/>
+      <w:lvlJc w:val="left"/>
+      <w:pPr>
+        <w:tabs>
+          <w:tab w:val="num" w:pos="5040"/>
+        </w:tabs>
+        <w:ind w:left="5040" w:hanging="360"/>
+      </w:pPr>
+      <w:rPr>
+        <w:rFonts w:ascii="Symbol" w:hAnsi="Symbol" w:hint="default"/>
+        <w:sz w:val="20"/>
+      </w:rPr>
+    </w:lvl>
+    <w:lvl w:ilvl="7" w:tentative="1">
+      <w:start w:val="1"/>
+      <w:numFmt w:val="bullet"/>
+      <w:lvlText w:val=""/>
+      <w:lvlJc w:val="left"/>
+      <w:pPr>
+        <w:tabs>
+          <w:tab w:val="num" w:pos="5760"/>
+        </w:tabs>
+        <w:ind w:left="5760" w:hanging="360"/>
+      </w:pPr>
+      <w:rPr>
+        <w:rFonts w:ascii="Symbol" w:hAnsi="Symbol" w:hint="default"/>
+        <w:sz w:val="20"/>
+      </w:rPr>
+    </w:lvl>
+    <w:lvl w:ilvl="8" w:tentative="1">
+      <w:start w:val="1"/>
+      <w:numFmt w:val="bullet"/>
+      <w:lvlText w:val=""/>
+      <w:lvlJc w:val="left"/>
+      <w:pPr>
+        <w:tabs>
+          <w:tab w:val="num" w:pos="6480"/>
+        </w:tabs>
+        <w:ind w:left="6480" w:hanging="360"/>
+      </w:pPr>
+      <w:rPr>
+        <w:rFonts w:ascii="Symbol" w:hAnsi="Symbol" w:hint="default"/>
+        <w:sz w:val="20"/>
+      </w:rPr>
+    </w:lvl>
+  </w:abstractNum>
+  <w:abstractNum w:abstractNumId="10" w15:restartNumberingAfterBreak="0">
+    <w:nsid w:val="6D90737C"/>
+    <w:multiLevelType w:val="hybridMultilevel"/>
+    <w:tmpl w:val="69B00D56"/>
+    <w:lvl w:ilvl="0" w:tplc="04090001">
+      <w:start w:val="1"/>
+      <w:numFmt w:val="bullet"/>
+      <w:lvlText w:val=""/>
+      <w:lvlJc w:val="left"/>
+      <w:pPr>
+        <w:ind w:left="720" w:hanging="360"/>
+      </w:pPr>
+      <w:rPr>
+        <w:rFonts w:ascii="Symbol" w:hAnsi="Symbol" w:hint="default"/>
+      </w:rPr>
+    </w:lvl>
+    <w:lvl w:ilvl="1" w:tplc="04090003" w:tentative="1">
+      <w:start w:val="1"/>
+      <w:numFmt w:val="bullet"/>
+      <w:lvlText w:val="o"/>
+      <w:lvlJc w:val="left"/>
+      <w:pPr>
+        <w:ind w:left="1440" w:hanging="360"/>
+      </w:pPr>
+      <w:rPr>
+        <w:rFonts w:ascii="Courier New" w:hAnsi="Courier New" w:cs="Courier New" w:hint="default"/>
+      </w:rPr>
+    </w:lvl>
+    <w:lvl w:ilvl="2" w:tplc="04090005" w:tentative="1">
+      <w:start w:val="1"/>
+      <w:numFmt w:val="bullet"/>
+      <w:lvlText w:val=""/>
+      <w:lvlJc w:val="left"/>
+      <w:pPr>
+        <w:ind w:left="2160" w:hanging="360"/>
+      </w:pPr>
+      <w:rPr>
+        <w:rFonts w:ascii="Wingdings" w:hAnsi="Wingdings" w:hint="default"/>
+      </w:rPr>
+    </w:lvl>
+    <w:lvl w:ilvl="3" w:tplc="04090001" w:tentative="1">
+      <w:start w:val="1"/>
+      <w:numFmt w:val="bullet"/>
+      <w:lvlText w:val=""/>
+      <w:lvlJc w:val="left"/>
+      <w:pPr>
+        <w:ind w:left="2880" w:hanging="360"/>
+      </w:pPr>
+      <w:rPr>
+        <w:rFonts w:ascii="Symbol" w:hAnsi="Symbol" w:hint="default"/>
+      </w:rPr>
+    </w:lvl>
+    <w:lvl w:ilvl="4" w:tplc="04090003" w:tentative="1">
+      <w:start w:val="1"/>
+      <w:numFmt w:val="bullet"/>
+      <w:lvlText w:val="o"/>
+      <w:lvlJc w:val="left"/>
+      <w:pPr>
+        <w:ind w:left="3600" w:hanging="360"/>
+      </w:pPr>
+      <w:rPr>
+        <w:rFonts w:ascii="Courier New" w:hAnsi="Courier New" w:cs="Courier New" w:hint="default"/>
+      </w:rPr>
+    </w:lvl>
+    <w:lvl w:ilvl="5" w:tplc="04090005" w:tentative="1">
+      <w:start w:val="1"/>
+      <w:numFmt w:val="bullet"/>
+      <w:lvlText w:val=""/>
+      <w:lvlJc w:val="left"/>
+      <w:pPr>
+        <w:ind w:left="4320" w:hanging="360"/>
+      </w:pPr>
+      <w:rPr>
+        <w:rFonts w:ascii="Wingdings" w:hAnsi="Wingdings" w:hint="default"/>
+      </w:rPr>
+    </w:lvl>
+    <w:lvl w:ilvl="6" w:tplc="04090001" w:tentative="1">
+      <w:start w:val="1"/>
+      <w:numFmt w:val="bullet"/>
+      <w:lvlText w:val=""/>
+      <w:lvlJc w:val="left"/>
+      <w:pPr>
+        <w:ind w:left="5040" w:hanging="360"/>
+      </w:pPr>
+      <w:rPr>
+        <w:rFonts w:ascii="Symbol" w:hAnsi="Symbol" w:hint="default"/>
+      </w:rPr>
+    </w:lvl>
+    <w:lvl w:ilvl="7" w:tplc="04090003" w:tentative="1">
+      <w:start w:val="1"/>
+      <w:numFmt w:val="bullet"/>
+      <w:lvlText w:val="o"/>
+      <w:lvlJc w:val="left"/>
+      <w:pPr>
+        <w:ind w:left="5760" w:hanging="360"/>
+      </w:pPr>
+      <w:rPr>
+        <w:rFonts w:ascii="Courier New" w:hAnsi="Courier New" w:cs="Courier New" w:hint="default"/>
+      </w:rPr>
+    </w:lvl>
+    <w:lvl w:ilvl="8" w:tplc="04090005" w:tentative="1">
+      <w:start w:val="1"/>
+      <w:numFmt w:val="bullet"/>
+      <w:lvlText w:val=""/>
+      <w:lvlJc w:val="left"/>
+      <w:pPr>
+        <w:ind w:left="6480" w:hanging="360"/>
+      </w:pPr>
+      <w:rPr>
+        <w:rFonts w:ascii="Wingdings" w:hAnsi="Wingdings" w:hint="default"/>
+      </w:rPr>
+    </w:lvl>
+  </w:abstractNum>
+  <w:abstractNum w:abstractNumId="11" w15:restartNumberingAfterBreak="0">
+    <w:nsid w:val="70C33531"/>
+    <w:multiLevelType w:val="multilevel"/>
+    <w:tmpl w:val="CE50620A"/>
+    <w:lvl w:ilvl="0">
+      <w:start w:val="1"/>
+      <w:numFmt w:val="bullet"/>
+      <w:lvlText w:val=""/>
+      <w:lvlJc w:val="left"/>
+      <w:pPr>
+        <w:tabs>
+          <w:tab w:val="num" w:pos="720"/>
+        </w:tabs>
+        <w:ind w:left="720" w:hanging="360"/>
+      </w:pPr>
+      <w:rPr>
+        <w:rFonts w:ascii="Symbol" w:hAnsi="Symbol" w:hint="default"/>
+        <w:sz w:val="20"/>
+      </w:rPr>
+    </w:lvl>
+    <w:lvl w:ilvl="1" w:tentative="1">
+      <w:start w:val="1"/>
+      <w:numFmt w:val="bullet"/>
+      <w:lvlText w:val=""/>
+      <w:lvlJc w:val="left"/>
+      <w:pPr>
+        <w:tabs>
+          <w:tab w:val="num" w:pos="1440"/>
+        </w:tabs>
+        <w:ind w:left="1440" w:hanging="360"/>
+      </w:pPr>
+      <w:rPr>
+        <w:rFonts w:ascii="Symbol" w:hAnsi="Symbol" w:hint="default"/>
+        <w:sz w:val="20"/>
+      </w:rPr>
+    </w:lvl>
+    <w:lvl w:ilvl="2" w:tentative="1">
+      <w:start w:val="1"/>
+      <w:numFmt w:val="bullet"/>
+      <w:lvlText w:val=""/>
+      <w:lvlJc w:val="left"/>
+      <w:pPr>
+        <w:tabs>
+          <w:tab w:val="num" w:pos="2160"/>
+        </w:tabs>
+        <w:ind w:left="2160" w:hanging="360"/>
+      </w:pPr>
+      <w:rPr>
+        <w:rFonts w:ascii="Symbol" w:hAnsi="Symbol" w:hint="default"/>
+        <w:sz w:val="20"/>
+      </w:rPr>
+    </w:lvl>
+    <w:lvl w:ilvl="3" w:tentative="1">
+      <w:start w:val="1"/>
+      <w:numFmt w:val="bullet"/>
+      <w:lvlText w:val=""/>
+      <w:lvlJc w:val="left"/>
+      <w:pPr>
+        <w:tabs>
+          <w:tab w:val="num" w:pos="2880"/>
+        </w:tabs>
+        <w:ind w:left="2880" w:hanging="360"/>
+      </w:pPr>
+      <w:rPr>
+        <w:rFonts w:ascii="Symbol" w:hAnsi="Symbol" w:hint="default"/>
+        <w:sz w:val="20"/>
+      </w:rPr>
+    </w:lvl>
+    <w:lvl w:ilvl="4" w:tentative="1">
+      <w:start w:val="1"/>
+      <w:numFmt w:val="bullet"/>
+      <w:lvlText w:val=""/>
+      <w:lvlJc w:val="left"/>
+      <w:pPr>
+        <w:tabs>
+          <w:tab w:val="num" w:pos="3600"/>
+        </w:tabs>
+        <w:ind w:left="3600" w:hanging="360"/>
+      </w:pPr>
+      <w:rPr>
+        <w:rFonts w:ascii="Symbol" w:hAnsi="Symbol" w:hint="default"/>
+        <w:sz w:val="20"/>
+      </w:rPr>
+    </w:lvl>
+    <w:lvl w:ilvl="5" w:tentative="1">
+      <w:start w:val="1"/>
+      <w:numFmt w:val="bullet"/>
+      <w:lvlText w:val=""/>
+      <w:lvlJc w:val="left"/>
+      <w:pPr>
+        <w:tabs>
+          <w:tab w:val="num" w:pos="4320"/>
+        </w:tabs>
+        <w:ind w:left="4320" w:hanging="360"/>
+      </w:pPr>
+      <w:rPr>
+        <w:rFonts w:ascii="Symbol" w:hAnsi="Symbol" w:hint="default"/>
+        <w:sz w:val="20"/>
+      </w:rPr>
+    </w:lvl>
+    <w:lvl w:ilvl="6" w:tentative="1">
+      <w:start w:val="1"/>
+      <w:numFmt w:val="bullet"/>
+      <w:lvlText w:val=""/>
+      <w:lvlJc w:val="left"/>
+      <w:pPr>
+        <w:tabs>
+          <w:tab w:val="num" w:pos="5040"/>
+        </w:tabs>
+        <w:ind w:left="5040" w:hanging="360"/>
+      </w:pPr>
+      <w:rPr>
+        <w:rFonts w:ascii="Symbol" w:hAnsi="Symbol" w:hint="default"/>
+        <w:sz w:val="20"/>
+      </w:rPr>
+    </w:lvl>
+    <w:lvl w:ilvl="7" w:tentative="1">
+      <w:start w:val="1"/>
+      <w:numFmt w:val="bullet"/>
+      <w:lvlText w:val=""/>
+      <w:lvlJc w:val="left"/>
+      <w:pPr>
+        <w:tabs>
+          <w:tab w:val="num" w:pos="5760"/>
+        </w:tabs>
+        <w:ind w:left="5760" w:hanging="360"/>
+      </w:pPr>
+      <w:rPr>
+        <w:rFonts w:ascii="Symbol" w:hAnsi="Symbol" w:hint="default"/>
+        <w:sz w:val="20"/>
+      </w:rPr>
+    </w:lvl>
+    <w:lvl w:ilvl="8" w:tentative="1">
+      <w:start w:val="1"/>
+      <w:numFmt w:val="bullet"/>
+      <w:lvlText w:val=""/>
+      <w:lvlJc w:val="left"/>
+      <w:pPr>
+        <w:tabs>
+          <w:tab w:val="num" w:pos="6480"/>
+        </w:tabs>
+        <w:ind w:left="6480" w:hanging="360"/>
+      </w:pPr>
+      <w:rPr>
+        <w:rFonts w:ascii="Symbol" w:hAnsi="Symbol" w:hint="default"/>
+        <w:sz w:val="20"/>
+      </w:rPr>
+    </w:lvl>
+  </w:abstractNum>
+  <w:abstractNum w:abstractNumId="12" w15:restartNumberingAfterBreak="0">
+    <w:nsid w:val="71A10273"/>
+    <w:multiLevelType w:val="multilevel"/>
+    <w:tmpl w:val="E28A5D6E"/>
+    <w:lvl w:ilvl="0">
+      <w:start w:val="1"/>
+      <w:numFmt w:val="bullet"/>
+      <w:lvlText w:val=""/>
+      <w:lvlJc w:val="left"/>
+      <w:pPr>
+        <w:tabs>
+          <w:tab w:val="num" w:pos="720"/>
+        </w:tabs>
+        <w:ind w:left="720" w:hanging="360"/>
+      </w:pPr>
+      <w:rPr>
+        <w:rFonts w:ascii="Symbol" w:hAnsi="Symbol" w:hint="default"/>
+        <w:sz w:val="20"/>
+      </w:rPr>
+    </w:lvl>
+    <w:lvl w:ilvl="1" w:tentative="1">
+      <w:start w:val="1"/>
+      <w:numFmt w:val="bullet"/>
+      <w:lvlText w:val=""/>
+      <w:lvlJc w:val="left"/>
+      <w:pPr>
+        <w:tabs>
+          <w:tab w:val="num" w:pos="1440"/>
+        </w:tabs>
+        <w:ind w:left="1440" w:hanging="360"/>
+      </w:pPr>
+      <w:rPr>
+        <w:rFonts w:ascii="Symbol" w:hAnsi="Symbol" w:hint="default"/>
+        <w:sz w:val="20"/>
+      </w:rPr>
+    </w:lvl>
+    <w:lvl w:ilvl="2" w:tentative="1">
+      <w:start w:val="1"/>
+      <w:numFmt w:val="bullet"/>
+      <w:lvlText w:val=""/>
+      <w:lvlJc w:val="left"/>
+      <w:pPr>
+        <w:tabs>
+          <w:tab w:val="num" w:pos="2160"/>
+        </w:tabs>
+        <w:ind w:left="2160" w:hanging="360"/>
+      </w:pPr>
+      <w:rPr>
+        <w:rFonts w:ascii="Symbol" w:hAnsi="Symbol" w:hint="default"/>
+        <w:sz w:val="20"/>
+      </w:rPr>
+    </w:lvl>
+    <w:lvl w:ilvl="3" w:tentative="1">
+      <w:start w:val="1"/>
+      <w:numFmt w:val="bullet"/>
+      <w:lvlText w:val=""/>
+      <w:lvlJc w:val="left"/>
+      <w:pPr>
+        <w:tabs>
+          <w:tab w:val="num" w:pos="2880"/>
+        </w:tabs>
+        <w:ind w:left="2880" w:hanging="360"/>
+      </w:pPr>
+      <w:rPr>
+        <w:rFonts w:ascii="Symbol" w:hAnsi="Symbol" w:hint="default"/>
+        <w:sz w:val="20"/>
+      </w:rPr>
+    </w:lvl>
+    <w:lvl w:ilvl="4" w:tentative="1">
+      <w:start w:val="1"/>
+      <w:numFmt w:val="bullet"/>
+      <w:lvlText w:val=""/>
+      <w:lvlJc w:val="left"/>
+      <w:pPr>
+        <w:tabs>
+          <w:tab w:val="num" w:pos="3600"/>
+        </w:tabs>
+        <w:ind w:left="3600" w:hanging="360"/>
+      </w:pPr>
+      <w:rPr>
+        <w:rFonts w:ascii="Symbol" w:hAnsi="Symbol" w:hint="default"/>
+        <w:sz w:val="20"/>
+      </w:rPr>
+    </w:lvl>
+    <w:lvl w:ilvl="5" w:tentative="1">
+      <w:start w:val="1"/>
+      <w:numFmt w:val="bullet"/>
+      <w:lvlText w:val=""/>
+      <w:lvlJc w:val="left"/>
+      <w:pPr>
+        <w:tabs>
+          <w:tab w:val="num" w:pos="4320"/>
+        </w:tabs>
+        <w:ind w:left="4320" w:hanging="360"/>
+      </w:pPr>
+      <w:rPr>
+        <w:rFonts w:ascii="Symbol" w:hAnsi="Symbol" w:hint="default"/>
+        <w:sz w:val="20"/>
+      </w:rPr>
+    </w:lvl>
+    <w:lvl w:ilvl="6" w:tentative="1">
+      <w:start w:val="1"/>
+      <w:numFmt w:val="bullet"/>
+      <w:lvlText w:val=""/>
+      <w:lvlJc w:val="left"/>
+      <w:pPr>
+        <w:tabs>
+          <w:tab w:val="num" w:pos="5040"/>
+        </w:tabs>
+        <w:ind w:left="5040" w:hanging="360"/>
+      </w:pPr>
+      <w:rPr>
+        <w:rFonts w:ascii="Symbol" w:hAnsi="Symbol" w:hint="default"/>
+        <w:sz w:val="20"/>
+      </w:rPr>
+    </w:lvl>
+    <w:lvl w:ilvl="7" w:tentative="1">
+      <w:start w:val="1"/>
+      <w:numFmt w:val="bullet"/>
+      <w:lvlText w:val=""/>
+      <w:lvlJc w:val="left"/>
+      <w:pPr>
+        <w:tabs>
+          <w:tab w:val="num" w:pos="5760"/>
+        </w:tabs>
+        <w:ind w:left="5760" w:hanging="360"/>
+      </w:pPr>
+      <w:rPr>
+        <w:rFonts w:ascii="Symbol" w:hAnsi="Symbol" w:hint="default"/>
+        <w:sz w:val="20"/>
+      </w:rPr>
+    </w:lvl>
+    <w:lvl w:ilvl="8" w:tentative="1">
+      <w:start w:val="1"/>
+      <w:numFmt w:val="bullet"/>
+      <w:lvlText w:val=""/>
+      <w:lvlJc w:val="left"/>
+      <w:pPr>
+        <w:tabs>
+          <w:tab w:val="num" w:pos="6480"/>
+        </w:tabs>
+        <w:ind w:left="6480" w:hanging="360"/>
+      </w:pPr>
+      <w:rPr>
+        <w:rFonts w:ascii="Symbol" w:hAnsi="Symbol" w:hint="default"/>
+        <w:sz w:val="20"/>
+      </w:rPr>
+    </w:lvl>
+  </w:abstractNum>
+  <w:abstractNum w:abstractNumId="13" w15:restartNumberingAfterBreak="0">
     <w:nsid w:val="71DA1839"/>
     <w:multiLevelType w:val="multilevel"/>
     <w:tmpl w:val="DB3C07E8"/>
@@ -1274,7 +2611,7 @@
       </w:rPr>
     </w:lvl>
   </w:abstractNum>
-  <w:abstractNum w:abstractNumId="6" w15:restartNumberingAfterBreak="0">
+  <w:abstractNum w:abstractNumId="14" w15:restartNumberingAfterBreak="0">
     <w:nsid w:val="77293C17"/>
     <w:multiLevelType w:val="multilevel"/>
     <w:tmpl w:val="E28A5D6E"/>
@@ -1424,25 +2761,49 @@
     </w:lvl>
   </w:abstractNum>
   <w:num w:numId="1" w16cid:durableId="1267812521">
+    <w:abstractNumId w:val="14"/>
+  </w:num>
+  <w:num w:numId="2" w16cid:durableId="966395115">
     <w:abstractNumId w:val="6"/>
   </w:num>
-  <w:num w:numId="2" w16cid:durableId="966395115">
+  <w:num w:numId="3" w16cid:durableId="1121727398">
+    <w:abstractNumId w:val="8"/>
+  </w:num>
+  <w:num w:numId="4" w16cid:durableId="1231966354">
     <w:abstractNumId w:val="2"/>
   </w:num>
-  <w:num w:numId="3" w16cid:durableId="1121727398">
+  <w:num w:numId="5" w16cid:durableId="1020276026">
+    <w:abstractNumId w:val="3"/>
+  </w:num>
+  <w:num w:numId="6" w16cid:durableId="1859349676">
+    <w:abstractNumId w:val="7"/>
+  </w:num>
+  <w:num w:numId="7" w16cid:durableId="1774935097">
+    <w:abstractNumId w:val="13"/>
+  </w:num>
+  <w:num w:numId="8" w16cid:durableId="2131826131">
     <w:abstractNumId w:val="4"/>
   </w:num>
-  <w:num w:numId="4" w16cid:durableId="1231966354">
+  <w:num w:numId="9" w16cid:durableId="1745451835">
+    <w:abstractNumId w:val="5"/>
+  </w:num>
+  <w:num w:numId="10" w16cid:durableId="502277818">
+    <w:abstractNumId w:val="1"/>
+  </w:num>
+  <w:num w:numId="11" w16cid:durableId="29033577">
+    <w:abstractNumId w:val="9"/>
+  </w:num>
+  <w:num w:numId="12" w16cid:durableId="920524354">
+    <w:abstractNumId w:val="11"/>
+  </w:num>
+  <w:num w:numId="13" w16cid:durableId="311106504">
     <w:abstractNumId w:val="0"/>
   </w:num>
-  <w:num w:numId="5" w16cid:durableId="1020276026">
-    <w:abstractNumId w:val="1"/>
+  <w:num w:numId="14" w16cid:durableId="87627259">
+    <w:abstractNumId w:val="12"/>
   </w:num>
-  <w:num w:numId="6" w16cid:durableId="1859349676">
-    <w:abstractNumId w:val="3"/>
-  </w:num>
-  <w:num w:numId="7" w16cid:durableId="1774935097">
-    <w:abstractNumId w:val="5"/>
+  <w:num w:numId="15" w16cid:durableId="835874785">
+    <w:abstractNumId w:val="10"/>
   </w:num>
 </w:numbering>
 </file>

</xml_diff>